<commit_message>
Final: regenerate notebook+report; 63/63 pipeline checks pass; 24/24 report+README audits pass
- Regenerate notebooks/Yashaswi_EcommerceSalesForecasting.ipynb (60 cells, refit/backtest workflow)
- Regenerate Yashaswi_EcommerceSalesForecastingReport.docx (load_data/calculate_kpis references added)
- create_report.py: Section 5 now explicitly mentions load_data(); Section 7 mentions calculate_kpis()
- All four artifacts (pipeline, dashboard, notebook, report) pass cross-consistency audit
- Pipeline: Ridge Regression selected (MAE=14,433, RMSE=17,267, R2=0.4707)
- Real data: Revenue=$2,297,201  Profit=$286,397  Margin=12.47%  YoY=+20.4%
- Backtest covers test period only (2017-05 to 2017-12); future forecast 2018-01 to 2018-06
</commit_message>
<xml_diff>
--- a/Yashaswi_EcommerceSalesForecastingReport.docx
+++ b/Yashaswi_EcommerceSalesForecastingReport.docx
@@ -569,7 +569,7 @@
           <w:i w:val="0"/>
           <w:sz w:val="22"/>
         </w:rPr>
-        <w:t>Data cleaning is implemented in the clean_data() function. All transformation steps are logged in a cleaning log for full transparency. No rows are removed arbitrarily — each removal has an explicit justification.</w:t>
+        <w:t>Data is loaded by load_data(), which reads the CSV with encoding fallback, validates required columns, and parses Order Date and Ship Date as datetime. Data cleaning is then implemented in the clean_data() function. All transformation steps are logged in a cleaning log for full transparency. No rows are removed arbitrarily — each removal has an explicit justification.</w:t>
       </w:r>
     </w:p>
     <w:p>
@@ -733,7 +733,7 @@
           <w:i w:val="0"/>
           <w:sz w:val="22"/>
         </w:rPr>
-        <w:t>All KPIs are computed dynamically from the loaded dataset.</w:t>
+        <w:t>All KPIs are computed dynamically at runtime by calculate_kpis(), which takes the cleaned and feature-engineered dataset as input. No KPI value is hard-coded.</w:t>
       </w:r>
     </w:p>
     <w:tbl>
@@ -1464,7 +1464,7 @@
         <w:pStyle w:val="Heading2"/>
       </w:pPr>
       <w:r>
-        <w:t>10.2 Future Forecast Generation</w:t>
+        <w:t>10.2 Model Refit on All Historical Data</w:t>
       </w:r>
     </w:p>
     <w:p>
@@ -1474,7 +1474,7 @@
           <w:i w:val="0"/>
           <w:sz w:val="22"/>
         </w:rPr>
-        <w:t>generate_forecast() iterates one month ahead at a time, feeding each prediction back into the lag feature window for the next period. The forecast horizon is configurable (3, 6, or 12 months). Predicted sales values are clipped at 0 (sales cannot be negative).</w:t>
+        <w:t>After evaluation and model selection (step 10.1), the selected model architecture is refit on ALL available historical observations using refit_selected_model(). This ensures the final forecasting model benefits from the complete dataset, not just the training split. The evaluation metrics reported in Section 11 are those computed on the held-out test set — NOT on this refit model.</w:t>
       </w:r>
     </w:p>
     <w:p>
@@ -1482,7 +1482,43 @@
         <w:pStyle w:val="Heading2"/>
       </w:pPr>
       <w:r>
-        <w:t>10.3 Forecast Uncertainty</w:t>
+        <w:t>10.3 Future Forecast Generation</w:t>
+      </w:r>
+    </w:p>
+    <w:p>
+      <w:r>
+        <w:rPr>
+          <w:b w:val="0"/>
+          <w:i w:val="0"/>
+          <w:sz w:val="22"/>
+        </w:rPr>
+        <w:t>generate_future_forecast() uses the refit model to produce future monthly sales estimates. It iterates one month ahead at a time, feeding each prediction back into the lag feature window for the next period. The forecast horizon is configurable (3, 6, or 12 months). Predicted sales values are clipped at 0 (sales cannot be negative).</w:t>
+      </w:r>
+    </w:p>
+    <w:p>
+      <w:pPr>
+        <w:pStyle w:val="Heading2"/>
+      </w:pPr>
+      <w:r>
+        <w:t>10.4 Backtest</w:t>
+      </w:r>
+    </w:p>
+    <w:p>
+      <w:r>
+        <w:rPr>
+          <w:b w:val="0"/>
+          <w:i w:val="0"/>
+          <w:sz w:val="22"/>
+        </w:rPr>
+        <w:t>generate_backtest() produces predictions on the chronological TEST PERIOD ONLY — observations the model did not see during training. It does NOT produce predictions over the training period. The backtest is displayed in the dashboard forecast chart to allow visual inspection of model accuracy on genuinely unseen data.</w:t>
+      </w:r>
+    </w:p>
+    <w:p>
+      <w:pPr>
+        <w:pStyle w:val="Heading2"/>
+      </w:pPr>
+      <w:r>
+        <w:t>10.5 Forecast Uncertainty</w:t>
       </w:r>
     </w:p>
     <w:p>
@@ -1701,7 +1737,7 @@
           <w:i w:val="0"/>
           <w:sz w:val="22"/>
         </w:rPr>
-        <w:t>The model with the lowest MAE is selected as the final forecaster (select_best_model()). The selected model is saved to models/sales_forecast_model.joblib using joblib. The payload includes: trained model, model name, evaluation DataFrame, feature column list, and training timestamp.</w:t>
+        <w:t>The model with the lowest MAE is selected by select_best_model(). The selected architecture is then refit on all historical data via refit_selected_model() before future forecasting. The refit model is saved to models/sales_forecast_model.joblib using joblib. The payload includes: model, model name, evaluation DataFrame (test-set metrics), feature column list, dataset hash, and training timestamp. The dataset hash enables staleness detection — the dashboard warns the user if the dataset has changed since the model was trained.</w:t>
       </w:r>
     </w:p>
     <w:p>
@@ -1727,7 +1763,7 @@
         <w:pStyle w:val="ListBullet"/>
       </w:pPr>
       <w:r>
-        <w:t>ACTUAL — historical monthly sales values</w:t>
+        <w:t>Actual Sales — full historical monthly sales values</w:t>
       </w:r>
     </w:p>
     <w:p>
@@ -1735,7 +1771,7 @@
         <w:pStyle w:val="ListBullet"/>
       </w:pPr>
       <w:r>
-        <w:t>BACKTEST — model predictions on the held-out test period (for visual error assessment)</w:t>
+        <w:t>Backtest Prediction (Test Period) — model predictions on the held-out test period only (observations not used during training; displayed for visual accuracy assessment)</w:t>
       </w:r>
     </w:p>
     <w:p>
@@ -1743,7 +1779,7 @@
         <w:pStyle w:val="ListBullet"/>
       </w:pPr>
       <w:r>
-        <w:t>FORECAST — future monthly predictions for the selected horizon (3, 6, or 12 months)</w:t>
+        <w:t>Future Forecast — iterative one-step-ahead predictions from the refit model for the selected horizon (3, 6, or 12 months)</w:t>
       </w:r>
     </w:p>
     <w:p>

</xml_diff>